<commit_message>
Sync CV and site to Mid Flutter Developer, add project links, and remove commit/version noise.
</commit_message>
<xml_diff>
--- a/assets/George_Amany_CV_2026.docx
+++ b/assets/George_Amany_CV_2026.docx
@@ -22,7 +22,7 @@
         <w:rPr>
           <w:sz w:val="24"/>
         </w:rPr>
-        <w:t>Senior Flutter Developer | Mobile &amp; Desktop Cross-Platform Engineer</w:t>
+        <w:t>Mid Flutter Developer | Mobile &amp; Desktop Cross-Platform Engineer</w:t>
       </w:r>
     </w:p>
     <w:p>
@@ -30,8 +30,41 @@
         <w:jc w:val="center"/>
       </w:pPr>
       <w:r>
-        <w:t>Cairo, Egypt | georgeamany5@gmail.com | +20 127 003 7845 | linkedin.com/in/george-amany-53b148219 | github.com/GeorgeAmany</w:t>
+        <w:t xml:space="preserve">Cairo, Egypt | </w:t>
       </w:r>
+      <w:hyperlink r:id="rId9">
+        <w:r>
+          <w:rPr>
+            <w:color w:val="0F766E"/>
+            <w:u w:val="single"/>
+          </w:rPr>
+          <w:t>georgeamany5@gmail.com</w:t>
+        </w:r>
+      </w:hyperlink>
+      <w:r>
+        <w:t xml:space="preserve"> | +20 127 003 7845 | </w:t>
+      </w:r>
+      <w:hyperlink r:id="rId10">
+        <w:r>
+          <w:rPr>
+            <w:color w:val="0F766E"/>
+            <w:u w:val="single"/>
+          </w:rPr>
+          <w:t>LinkedIn</w:t>
+        </w:r>
+      </w:hyperlink>
+      <w:r>
+        <w:t xml:space="preserve"> | </w:t>
+      </w:r>
+      <w:hyperlink r:id="rId11">
+        <w:r>
+          <w:rPr>
+            <w:color w:val="0F766E"/>
+            <w:u w:val="single"/>
+          </w:rPr>
+          <w:t>GitHub</w:t>
+        </w:r>
+      </w:hyperlink>
     </w:p>
     <w:p/>
     <w:p>
@@ -94,7 +127,7 @@
         <w:pStyle w:val="ListBullet"/>
       </w:pPr>
       <w:r>
-        <w:t>Led development on Fuse (influencer marketing platform, 185+ commits): dual-app architecture for agencies and influencers with Cubit, Injectable DI, Freezed models, Dio networking, Firebase Auth/Realtime DB, and Storyly integration.</w:t>
+        <w:t>Led development on Fuse influencer marketing platform: dual-app architecture for agencies and influencers with Cubit, Injectable DI, Freezed models, Dio networking, Firebase Auth/Realtime DB, and Storyly integration.</w:t>
       </w:r>
     </w:p>
     <w:p>
@@ -102,7 +135,7 @@
         <w:pStyle w:val="ListBullet"/>
       </w:pPr>
       <w:r>
-        <w:t>Built Taleem student and employee apps (300+ combined commits) for Islamic education: REST v2 API integration, Quran local SQLite databases, attendance/memorization/evaluation modules, and GitHub Actions CI pipeline for automated debug APK builds on Flutter 3.35.7.</w:t>
+        <w:t>Built Taleem student and employee apps for Islamic education: REST v2 API integration, Quran local SQLite databases, attendance/memorization/evaluation modules, and GitHub Actions CI pipeline for automated debug APK builds.</w:t>
       </w:r>
     </w:p>
     <w:p>
@@ -110,7 +143,7 @@
         <w:pStyle w:val="ListBullet"/>
       </w:pPr>
       <w:r>
-        <w:t>Enhanced Noor Institute app (v3.7.0, 63+ commits): Stripe payment flow, Pusher real-time chat, Floor local DB, Retrofit API layer, Syncfusion calendar, and Firebase push notifications.</w:t>
+        <w:t>Enhanced Noor Institute app: Stripe payment flow, Pusher real-time chat, Floor local DB, Retrofit API layer, Syncfusion calendar, and Firebase push notifications.</w:t>
       </w:r>
     </w:p>
     <w:p>
@@ -134,7 +167,7 @@
         <w:pStyle w:val="ListBullet"/>
       </w:pPr>
       <w:r>
-        <w:t>Published and maintained open-source Flutter packages on pub.dev: animated_contact_us (v0.0.8) and liquid_wave_indicator (v0.2.2).</w:t>
+        <w:t>Published and maintained open-source Flutter packages on pub.dev (animated_contact_us, liquid_wave_indicator).</w:t>
       </w:r>
     </w:p>
     <w:p>
@@ -205,7 +238,7 @@
     </w:p>
     <w:p>
       <w:r>
-        <w:t>Production app (v3.7.0) for students, teachers, courses, homework, schedules, invoices, and chat. Clean Architecture with BLoC, Retrofit/Dio, Floor DB, Stripe payments, Pusher real-time, Firebase push.</w:t>
+        <w:t>Production app for students, teachers, courses, homework, schedules, invoices, and chat. Clean Architecture with BLoC, Retrofit/Dio, Floor DB, Stripe payments, Pusher real-time, Firebase push.</w:t>
       </w:r>
     </w:p>
     <w:p>
@@ -215,8 +248,29 @@
     </w:p>
     <w:p>
       <w:r>
-        <w:t>Platform: Google Play &amp; App Store</w:t>
+        <w:t xml:space="preserve">Links: </w:t>
       </w:r>
+      <w:hyperlink r:id="rId12">
+        <w:r>
+          <w:rPr>
+            <w:color w:val="0F766E"/>
+            <w:u w:val="single"/>
+          </w:rPr>
+          <w:t>Google Play</w:t>
+        </w:r>
+      </w:hyperlink>
+      <w:r>
+        <w:t xml:space="preserve"> · </w:t>
+      </w:r>
+      <w:hyperlink r:id="rId13">
+        <w:r>
+          <w:rPr>
+            <w:color w:val="0F766E"/>
+            <w:u w:val="single"/>
+          </w:rPr>
+          <w:t>App Store</w:t>
+        </w:r>
+      </w:hyperlink>
     </w:p>
     <w:p>
       <w:pPr>
@@ -242,11 +296,6 @@
       </w:r>
     </w:p>
     <w:p>
-      <w:r>
-        <w:t>Platform: Mobile App (Neural Design Studios)</w:t>
-      </w:r>
-    </w:p>
-    <w:p>
       <w:pPr>
         <w:pStyle w:val="Heading2"/>
       </w:pPr>
@@ -267,11 +316,6 @@
     <w:p>
       <w:r>
         <w:t>Technologies: Flutter, BLoC, Dio, Hive, SQLite, Firebase Messaging, Fl Chart, Table Calendar</w:t>
-      </w:r>
-    </w:p>
-    <w:p>
-      <w:r>
-        <w:t>Platform: Mobile Apps</w:t>
       </w:r>
     </w:p>
     <w:p>
@@ -299,8 +343,17 @@
     </w:p>
     <w:p>
       <w:r>
-        <w:t>Platform: Google Play</w:t>
+        <w:t xml:space="preserve">Links: </w:t>
       </w:r>
+      <w:hyperlink r:id="rId14">
+        <w:r>
+          <w:rPr>
+            <w:color w:val="0F766E"/>
+            <w:u w:val="single"/>
+          </w:rPr>
+          <w:t>Google Play</w:t>
+        </w:r>
+      </w:hyperlink>
     </w:p>
     <w:p>
       <w:pPr>
@@ -323,11 +376,6 @@
     <w:p>
       <w:r>
         <w:t>Technologies: Flutter, BLoC, Dio, Hive, Window Manager, Printing, PDF, Connectivity Plus</w:t>
-      </w:r>
-    </w:p>
-    <w:p>
-      <w:r>
-        <w:t>Platform: Mobile &amp; Desktop</w:t>
       </w:r>
     </w:p>
     <w:p>
@@ -355,8 +403,17 @@
     </w:p>
     <w:p>
       <w:r>
-        <w:t>Platform: Production App</w:t>
+        <w:t xml:space="preserve">Links: </w:t>
       </w:r>
+      <w:hyperlink r:id="rId15">
+        <w:r>
+          <w:rPr>
+            <w:color w:val="0F766E"/>
+            <w:u w:val="single"/>
+          </w:rPr>
+          <w:t>Google Play</w:t>
+        </w:r>
+      </w:hyperlink>
     </w:p>
     <w:p>
       <w:pPr>
@@ -383,8 +440,17 @@
     </w:p>
     <w:p>
       <w:r>
-        <w:t>Platform: Google Play</w:t>
+        <w:t xml:space="preserve">Links: </w:t>
       </w:r>
+      <w:hyperlink r:id="rId16">
+        <w:r>
+          <w:rPr>
+            <w:color w:val="0F766E"/>
+            <w:u w:val="single"/>
+          </w:rPr>
+          <w:t>Google Play</w:t>
+        </w:r>
+      </w:hyperlink>
     </w:p>
     <w:p>
       <w:pPr>
@@ -407,11 +473,6 @@
     <w:p>
       <w:r>
         <w:t>Technologies: Flutter Desktop, BLoC, Dio, Hive, PDF, Printing, Window Manager</w:t>
-      </w:r>
-    </w:p>
-    <w:p>
-      <w:r>
-        <w:t>Platform: Desktop App</w:t>
       </w:r>
     </w:p>
     <w:p>
@@ -439,15 +500,36 @@
     </w:p>
     <w:p>
       <w:r>
-        <w:t>Platform: Mobile App</w:t>
+        <w:t xml:space="preserve">Links: </w:t>
       </w:r>
+      <w:hyperlink r:id="rId17">
+        <w:r>
+          <w:rPr>
+            <w:color w:val="0F766E"/>
+            <w:u w:val="single"/>
+          </w:rPr>
+          <w:t>Google Play</w:t>
+        </w:r>
+      </w:hyperlink>
+      <w:r>
+        <w:t xml:space="preserve"> · </w:t>
+      </w:r>
+      <w:hyperlink r:id="rId18">
+        <w:r>
+          <w:rPr>
+            <w:color w:val="0F766E"/>
+            <w:u w:val="single"/>
+          </w:rPr>
+          <w:t>App Store</w:t>
+        </w:r>
+      </w:hyperlink>
     </w:p>
     <w:p>
       <w:pPr>
         <w:pStyle w:val="Heading2"/>
       </w:pPr>
       <w:r>
-        <w:t>animated_contact_us &amp; liquid_wave_indicator</w:t>
+        <w:t>animated_contact_us</w:t>
       </w:r>
     </w:p>
     <w:p>
@@ -457,7 +539,7 @@
     </w:p>
     <w:p>
       <w:r>
-        <w:t>Published Flutter UI packages for animated contact widgets and liquid wave progress indicators.</w:t>
+        <w:t>Published Flutter UI package for animated contact widgets.</w:t>
       </w:r>
     </w:p>
     <w:p>
@@ -467,8 +549,78 @@
     </w:p>
     <w:p>
       <w:r>
-        <w:t>Platform: pub.dev</w:t>
+        <w:t xml:space="preserve">Links: </w:t>
       </w:r>
+      <w:hyperlink r:id="rId19">
+        <w:r>
+          <w:rPr>
+            <w:color w:val="0F766E"/>
+            <w:u w:val="single"/>
+          </w:rPr>
+          <w:t>pub.dev</w:t>
+        </w:r>
+      </w:hyperlink>
+      <w:r>
+        <w:t xml:space="preserve"> · </w:t>
+      </w:r>
+      <w:hyperlink r:id="rId20">
+        <w:r>
+          <w:rPr>
+            <w:color w:val="0F766E"/>
+            <w:u w:val="single"/>
+          </w:rPr>
+          <w:t>GitHub</w:t>
+        </w:r>
+      </w:hyperlink>
+    </w:p>
+    <w:p>
+      <w:pPr>
+        <w:pStyle w:val="Heading2"/>
+      </w:pPr>
+      <w:r>
+        <w:t>liquid_wave_indicator</w:t>
+      </w:r>
+    </w:p>
+    <w:p>
+      <w:r>
+        <w:t>Domain: Open Source (pub.dev)</w:t>
+      </w:r>
+    </w:p>
+    <w:p>
+      <w:r>
+        <w:t>Published Flutter UI package for liquid wave progress indicators.</w:t>
+      </w:r>
+    </w:p>
+    <w:p>
+      <w:r>
+        <w:t>Technologies: Flutter</w:t>
+      </w:r>
+    </w:p>
+    <w:p>
+      <w:r>
+        <w:t xml:space="preserve">Links: </w:t>
+      </w:r>
+      <w:hyperlink r:id="rId21">
+        <w:r>
+          <w:rPr>
+            <w:color w:val="0F766E"/>
+            <w:u w:val="single"/>
+          </w:rPr>
+          <w:t>pub.dev</w:t>
+        </w:r>
+      </w:hyperlink>
+      <w:r>
+        <w:t xml:space="preserve"> · </w:t>
+      </w:r>
+      <w:hyperlink r:id="rId22">
+        <w:r>
+          <w:rPr>
+            <w:color w:val="0F766E"/>
+            <w:u w:val="single"/>
+          </w:rPr>
+          <w:t>GitHub</w:t>
+        </w:r>
+      </w:hyperlink>
     </w:p>
     <w:p>
       <w:pPr>
@@ -495,8 +647,29 @@
     </w:p>
     <w:p>
       <w:r>
-        <w:t>Platform: Google Play &amp; App Store</w:t>
+        <w:t xml:space="preserve">Links: </w:t>
       </w:r>
+      <w:hyperlink r:id="rId23">
+        <w:r>
+          <w:rPr>
+            <w:color w:val="0F766E"/>
+            <w:u w:val="single"/>
+          </w:rPr>
+          <w:t>Google Play</w:t>
+        </w:r>
+      </w:hyperlink>
+      <w:r>
+        <w:t xml:space="preserve"> · </w:t>
+      </w:r>
+      <w:hyperlink r:id="rId24">
+        <w:r>
+          <w:rPr>
+            <w:color w:val="0F766E"/>
+            <w:u w:val="single"/>
+          </w:rPr>
+          <w:t>App Store</w:t>
+        </w:r>
+      </w:hyperlink>
     </w:p>
     <w:p>
       <w:pPr>

</xml_diff>

<commit_message>
Add portfolio website link to CV contact section (PDF and DOCX).
</commit_message>
<xml_diff>
--- a/assets/George_Amany_CV_2026.docx
+++ b/assets/George_Amany_CV_2026.docx
@@ -63,6 +63,18 @@
             <w:u w:val="single"/>
           </w:rPr>
           <w:t>GitHub</w:t>
+        </w:r>
+      </w:hyperlink>
+      <w:r>
+        <w:t xml:space="preserve"> | </w:t>
+      </w:r>
+      <w:hyperlink r:id="rId12">
+        <w:r>
+          <w:rPr>
+            <w:color w:val="0F766E"/>
+            <w:u w:val="single"/>
+          </w:rPr>
+          <w:t>Portfolio</w:t>
         </w:r>
       </w:hyperlink>
     </w:p>
@@ -250,7 +262,7 @@
       <w:r>
         <w:t xml:space="preserve">Links: </w:t>
       </w:r>
-      <w:hyperlink r:id="rId12">
+      <w:hyperlink r:id="rId13">
         <w:r>
           <w:rPr>
             <w:color w:val="0F766E"/>
@@ -262,7 +274,7 @@
       <w:r>
         <w:t xml:space="preserve"> · </w:t>
       </w:r>
-      <w:hyperlink r:id="rId13">
+      <w:hyperlink r:id="rId14">
         <w:r>
           <w:rPr>
             <w:color w:val="0F766E"/>
@@ -345,7 +357,7 @@
       <w:r>
         <w:t xml:space="preserve">Links: </w:t>
       </w:r>
-      <w:hyperlink r:id="rId14">
+      <w:hyperlink r:id="rId15">
         <w:r>
           <w:rPr>
             <w:color w:val="0F766E"/>
@@ -405,7 +417,7 @@
       <w:r>
         <w:t xml:space="preserve">Links: </w:t>
       </w:r>
-      <w:hyperlink r:id="rId15">
+      <w:hyperlink r:id="rId16">
         <w:r>
           <w:rPr>
             <w:color w:val="0F766E"/>
@@ -442,7 +454,7 @@
       <w:r>
         <w:t xml:space="preserve">Links: </w:t>
       </w:r>
-      <w:hyperlink r:id="rId16">
+      <w:hyperlink r:id="rId17">
         <w:r>
           <w:rPr>
             <w:color w:val="0F766E"/>
@@ -502,7 +514,7 @@
       <w:r>
         <w:t xml:space="preserve">Links: </w:t>
       </w:r>
-      <w:hyperlink r:id="rId17">
+      <w:hyperlink r:id="rId18">
         <w:r>
           <w:rPr>
             <w:color w:val="0F766E"/>
@@ -514,7 +526,7 @@
       <w:r>
         <w:t xml:space="preserve"> · </w:t>
       </w:r>
-      <w:hyperlink r:id="rId18">
+      <w:hyperlink r:id="rId19">
         <w:r>
           <w:rPr>
             <w:color w:val="0F766E"/>
@@ -551,7 +563,7 @@
       <w:r>
         <w:t xml:space="preserve">Links: </w:t>
       </w:r>
-      <w:hyperlink r:id="rId19">
+      <w:hyperlink r:id="rId20">
         <w:r>
           <w:rPr>
             <w:color w:val="0F766E"/>
@@ -563,7 +575,7 @@
       <w:r>
         <w:t xml:space="preserve"> · </w:t>
       </w:r>
-      <w:hyperlink r:id="rId20">
+      <w:hyperlink r:id="rId21">
         <w:r>
           <w:rPr>
             <w:color w:val="0F766E"/>
@@ -600,7 +612,7 @@
       <w:r>
         <w:t xml:space="preserve">Links: </w:t>
       </w:r>
-      <w:hyperlink r:id="rId21">
+      <w:hyperlink r:id="rId22">
         <w:r>
           <w:rPr>
             <w:color w:val="0F766E"/>
@@ -612,7 +624,7 @@
       <w:r>
         <w:t xml:space="preserve"> · </w:t>
       </w:r>
-      <w:hyperlink r:id="rId22">
+      <w:hyperlink r:id="rId23">
         <w:r>
           <w:rPr>
             <w:color w:val="0F766E"/>
@@ -649,7 +661,7 @@
       <w:r>
         <w:t xml:space="preserve">Links: </w:t>
       </w:r>
-      <w:hyperlink r:id="rId23">
+      <w:hyperlink r:id="rId24">
         <w:r>
           <w:rPr>
             <w:color w:val="0F766E"/>
@@ -661,7 +673,7 @@
       <w:r>
         <w:t xml:space="preserve"> · </w:t>
       </w:r>
-      <w:hyperlink r:id="rId24">
+      <w:hyperlink r:id="rId25">
         <w:r>
           <w:rPr>
             <w:color w:val="0F766E"/>

</xml_diff>